<commit_message>
Merge QA and Perf agent teams into this repo; copyright Ketan Ranmal and Claude
Bundles qa-agent-team/ and perf-agent-team/ (without their .docx guides),
points the hub at them by default, updates README, guide and diagrams.

Co-Authored-By: Claude Sonnet 5.5 <noreply@anthropic.com>
</commit_message>
<xml_diff>
--- a/docs/Agent-Hub-User-Guide.docx
+++ b/docs/Agent-Hub-User-Guide.docx
@@ -1176,7 +1176,7 @@
         <w:spacing w:after="120"/>
       </w:pPr>
       <w:r>
-        <w:t xml:space="preserve">The hub is the front door. The Performance and QA teams are separate projects it talks to. Download all three into the same folder, side by side.</w:t>
+        <w:t xml:space="preserve">Everything is in one repository: the hub, the Performance team, the QA team and Pretty CSV.</w:t>
       </w:r>
     </w:p>
     <w:p>
@@ -1194,43 +1194,7 @@
           <w:sz w:val="20"/>
           <w:szCs w:val="20"/>
         </w:rPr>
-        <w:t xml:space="preserve">mkdir agent-tools &amp;&amp; cd agent-tools</w:t>
-      </w:r>
-    </w:p>
-    <w:p>
-      <w:pPr>
-        <w:pBdr>
-          <w:left w:val="single" w:color="2457D6" w:sz="24" w:space="8"/>
-        </w:pBdr>
-        <w:shd w:fill="F1F3F6" w:color="auto" w:val="clear"/>
-        <w:spacing w:after="0"/>
-        <w:ind w:left="200"/>
-      </w:pPr>
-      <w:r>
-        <w:rPr>
-          <w:rFonts w:ascii="Menlo" w:cs="Menlo" w:eastAsia="Menlo" w:hAnsi="Menlo"/>
-          <w:sz w:val="20"/>
-          <w:szCs w:val="20"/>
-        </w:rPr>
         <w:t xml:space="preserve">git clone https://github.com/kranmal/agent-hub.git</w:t>
-      </w:r>
-    </w:p>
-    <w:p>
-      <w:pPr>
-        <w:pBdr>
-          <w:left w:val="single" w:color="2457D6" w:sz="24" w:space="8"/>
-        </w:pBdr>
-        <w:shd w:fill="F1F3F6" w:color="auto" w:val="clear"/>
-        <w:spacing w:after="0"/>
-        <w:ind w:left="200"/>
-      </w:pPr>
-      <w:r>
-        <w:rPr>
-          <w:rFonts w:ascii="Menlo" w:cs="Menlo" w:eastAsia="Menlo" w:hAnsi="Menlo"/>
-          <w:sz w:val="20"/>
-          <w:szCs w:val="20"/>
-        </w:rPr>
-        <w:t xml:space="preserve">git clone https://github.com/kranmal/qa-agent-team.git</w:t>
       </w:r>
     </w:p>
     <w:p>
@@ -1248,7 +1212,7 @@
           <w:sz w:val="20"/>
           <w:szCs w:val="20"/>
         </w:rPr>
-        <w:t xml:space="preserve">git clone https://github.com/kranmal/perf-agent-team.git</w:t>
+        <w:t xml:space="preserve">cd agent-hub</w:t>
       </w:r>
     </w:p>
     <w:tbl>
@@ -1294,7 +1258,7 @@
               <w:t xml:space="preserve">You should see  </w:t>
             </w:r>
             <w:r>
-              <w:t xml:space="preserve">Three folders next to each other: agent-hub, qa-agent-team and perf-agent-team.</w:t>
+              <w:t xml:space="preserve">A folder called agent-hub that contains qa-agent-team and perf-agent-team.</w:t>
             </w:r>
           </w:p>
         </w:tc>
@@ -1348,7 +1312,7 @@
               <w:t xml:space="preserve">Tip  </w:t>
             </w:r>
             <w:r>
-              <w:t xml:space="preserve">Keep them where they are. The hub looks for the other two folders next to itself. If you keep them elsewhere, see the settings in Part 7.</w:t>
+              <w:t xml:space="preserve">Keep the folder where it is. The hub finds the two teams inside it. If you keep copies elsewhere, see the settings in Part 7.</w:t>
             </w:r>
           </w:p>
         </w:tc>
@@ -1390,7 +1354,7 @@
           <w:sz w:val="20"/>
           <w:szCs w:val="20"/>
         </w:rPr>
-        <w:t xml:space="preserve">cd qa-agent-team &amp;&amp; ./install.sh &amp;&amp; cd ..</w:t>
+        <w:t xml:space="preserve">(cd qa-agent-team &amp;&amp; ./install.sh)</w:t>
       </w:r>
     </w:p>
     <w:p>
@@ -1408,7 +1372,7 @@
           <w:sz w:val="20"/>
           <w:szCs w:val="20"/>
         </w:rPr>
-        <w:t xml:space="preserve">cd perf-agent-team &amp;&amp; ./install.sh &amp;&amp; cd ..</w:t>
+        <w:t xml:space="preserve">(cd perf-agent-team &amp;&amp; ./install.sh)</w:t>
       </w:r>
     </w:p>
     <w:tbl>
@@ -1643,24 +1607,6 @@
       </w:pPr>
       <w:r>
         <w:t xml:space="preserve">Step 5. Start the Agent Hub</w:t>
-      </w:r>
-    </w:p>
-    <w:p>
-      <w:pPr>
-        <w:pBdr>
-          <w:left w:val="single" w:color="2457D6" w:sz="24" w:space="8"/>
-        </w:pBdr>
-        <w:shd w:fill="F1F3F6" w:color="auto" w:val="clear"/>
-        <w:spacing w:after="0"/>
-        <w:ind w:left="200"/>
-      </w:pPr>
-      <w:r>
-        <w:rPr>
-          <w:rFonts w:ascii="Menlo" w:cs="Menlo" w:eastAsia="Menlo" w:hAnsi="Menlo"/>
-          <w:sz w:val="20"/>
-          <w:szCs w:val="20"/>
-        </w:rPr>
-        <w:t xml:space="preserve">cd agent-hub</w:t>
       </w:r>
     </w:p>
     <w:p>
@@ -7434,7 +7380,7 @@
           </w:tcPr>
           <w:p>
             <w:r>
-              <w:t xml:space="preserve">Your agent-tools folder</w:t>
+              <w:t xml:space="preserve">Your agent-hub folder</w:t>
             </w:r>
           </w:p>
         </w:tc>
@@ -7456,7 +7402,7 @@
           </w:tcPr>
           <w:p>
             <w:r>
-              <w:t xml:space="preserve">The three projects you downloaded.</w:t>
+              <w:t xml:space="preserve">The hub, both teams and Pretty CSV.</w:t>
             </w:r>
           </w:p>
         </w:tc>
@@ -8555,7 +8501,7 @@
           </w:tcPr>
           <w:p>
             <w:r>
-              <w:t xml:space="preserve">../qa-agent-team</w:t>
+              <w:t xml:space="preserve">./qa-agent-team</w:t>
             </w:r>
           </w:p>
         </w:tc>
@@ -8631,7 +8577,7 @@
           </w:tcPr>
           <w:p>
             <w:r>
-              <w:t xml:space="preserve">../perf-agent-team</w:t>
+              <w:t xml:space="preserve">./perf-agent-team</w:t>
             </w:r>
           </w:p>
         </w:tc>

</xml_diff>